<commit_message>
docs(proposal): align tools, hosting and declaration with the current workflow
Replaces Hugging Face Spaces with the free VM target, uses Groq for live
speech and answers with open-source models as offline fallback, states the
in-process event bus, instructor-only video publishing, the visibility
baseline for wrong-screen, self-hosted LiveKit for load tests, and ties the
declaration's similarity claim to the supervisor's Turnitin check.

Co-Authored-By: Claude Fable 5.1 <noreply@anthropic.com>
</commit_message>
<xml_diff>
--- a/docs/Keeping_Students_Focused_Online_Revised.docx
+++ b/docs/Keeping_Students_Focused_Online_Revised.docx
@@ -326,7 +326,7 @@
         <w:jc w:val="both"/>
       </w:pPr>
       <w:r>
-        <w:t xml:space="preserve">This is to certify that, we declare that our FYP “Keeping Students Focused Online: An AI Virtual Classroom for Attention Monitoring and Learning Guidance” is the result of our own research and development. We have not copied the proposal from anywhere. We declare that in our FYP proposal similarity index is less than 20%.</w:t>
+        <w:t xml:space="preserve">This is to certify that, we declare that our FYP “Keeping Students Focused Online: An AI Virtual Classroom for Attention Monitoring and Learning Guidance” is the result of our own research and development. We have not copied the proposal from anywhere. We declare that the similarity index of this proposal, as verified through the university’s Turnitin check arranged by our supervisor before submission, is below 20%.</w:t>
       </w:r>
     </w:p>
     <w:p>
@@ -3200,7 +3200,7 @@
         <w:jc w:val="both"/>
       </w:pPr>
       <w:r>
-        <w:t xml:space="preserve">Audio and video travel over WebRTC through a Selective Forwarding Unit, which scales much better than peer-to-peer connections, while events and alerts use a separate secure WebSocket channel backed by Redis.</w:t>
+        <w:t xml:space="preserve">Audio and video travel over WebRTC through a Selective Forwarding Unit, which scales much better than peer-to-peer connections. Only the instructor publishes video; a student’s camera feeds the local vision worker and is never transmitted. Events and alerts use a separate secure WebSocket channel served by an in-process event bus, with Redis pub/sub added only if the API ever has to run as several replicas.</w:t>
       </w:r>
     </w:p>
     <w:p>
@@ -3221,7 +3221,7 @@
         <w:jc w:val="both"/>
       </w:pPr>
       <w:r>
-        <w:t xml:space="preserve">The first objective lives entirely in the student’s browser, built on MediaPipe Face Mesh (Kartynnik et al., 2019) [13]. Camera frames are sampled at five to ten per second and 468 landmarks are extracted from each. From those we compute the Eye Aspect Ratio (Soukupová &amp; Čech, 2016) [10], blink rate and PERCLOS for drowsiness, and head pose together with gaze direction for attention. Nothing but these numbers leaves the device. On the server, a temporal classifier looks at a sliding window of them to decide the student’s state. A blink or a quick glance is therefore not mistaken for drowsiness or distraction, and the classifier reports an </w:t>
+        <w:t xml:space="preserve">The first objective lives entirely in the student’s browser, built on MediaPipe Face Mesh (Kartynnik et al., 2019) [13] running inside a Web Worker so that it keeps working when the class tab is in the background. Camera frames are sampled at five to ten per second and 468 landmarks are extracted from each. From those we compute the Eye Aspect Ratio (Soukupová &amp; Čech, 2016) [10], blink rate and PERCLOS for drowsiness, and head pose together with gaze direction for attention. Nothing but these numbers leaves the device. On the server, a temporal classifier looks at a sliding window of them to decide the student’s state. A blink or a quick glance is therefore not mistaken for drowsiness or distraction, and the classifier reports an </w:t>
       </w:r>
       <w:r>
         <w:rPr>
@@ -3314,7 +3314,7 @@
         <w:jc w:val="both"/>
       </w:pPr>
       <w:r>
-        <w:t xml:space="preserve">The second objective asks whether what the student sees matches what is being taught. The shared screen is sampled every few seconds, and a perceptual-hash filter drops frames that have not changed, which removes most of the processing cost. Frames that did change go through OCR (Du et al., 2020) [14] and image/text embeddings (Radford et al., 2021; Reimers &amp; Gurevych, 2019) [15], [16], and the result is compared with the embedding of the instructor’s current slide and the slides on either side of it. Scrolling, a page still loading, or opening a reference will all cause a short mismatch, so a low similarity score has to persist beyond a configurable grace period before a compliance event is raised.</w:t>
+        <w:t xml:space="preserve">The second objective asks whether what the student sees matches what is being taught. The baseline needs no model at all: the browser reports whether the class tab is still visible and in front, which already catches a switch to another window or application without taking a single screenshot. The content comparison is the extension built on top of it. The shared screen is sampled every few seconds, and a perceptual-hash filter drops frames that have not changed, which removes most of the processing cost. Frames that did change go through OCR (Du et al., 2020) [14] and image/text embeddings (Radford et al., 2021; Reimers &amp; Gurevych, 2019) [15], [16], and the result is compared with the embedding of the instructor’s current slide and the slides on either side of it. Scrolling, a page still loading, or opening a reference will all cause a short mismatch, so a low similarity score has to persist beyond a configurable grace period before a compliance event is raised.</w:t>
       </w:r>
     </w:p>
     <w:p>
@@ -5400,7 +5400,7 @@
                 <w:sz w:val="21"/>
                 <w:szCs w:val="21"/>
               </w:rPr>
-              <w:t xml:space="preserve">WebRTC through LiveKit Cloud free tier (SFU with built-in TURN), WebSocket, Redis pub/sub</w:t>
+              <w:t xml:space="preserve">WebRTC through LiveKit (Cloud free tier for live demos; the open-source LiveKit server self-hosted on the project VM for load tests), WebSocket, in-process event bus (Redis pub/sub only if the API runs as several replicas)</w:t>
             </w:r>
           </w:p>
         </w:tc>
@@ -5459,7 +5459,7 @@
                 <w:sz w:val="21"/>
                 <w:szCs w:val="21"/>
               </w:rPr>
-              <w:t xml:space="preserve">MediaPipe (runs in the browser), OpenCV, PyTorch</w:t>
+              <w:t xml:space="preserve">MediaPipe Face Landmarker (runs in a Web Worker in the browser), OpenCV, PyTorch</w:t>
             </w:r>
           </w:p>
         </w:tc>
@@ -5518,7 +5518,7 @@
                 <w:sz w:val="21"/>
                 <w:szCs w:val="21"/>
               </w:rPr>
-              <w:t xml:space="preserve">PaddleOCR, CLIP, Sentence-BERT (open-source models)</w:t>
+              <w:t xml:space="preserve">Page Visibility API baseline; tesseract.js and MiniLM sentence embeddings via transformers.js on-device; PaddleOCR, CLIP and Sentence-BERT server-side for the client-vs-server comparison experiment</w:t>
             </w:r>
           </w:p>
         </w:tc>
@@ -5577,7 +5577,7 @@
                 <w:sz w:val="21"/>
                 <w:szCs w:val="21"/>
               </w:rPr>
-              <w:t xml:space="preserve">faster-whisper (open-source Whisper, small/base model on CPU; no paid API)</w:t>
+              <w:t xml:space="preserve">Groq free tier (Whisper large-v3, 8 hours of audio per day) for live lectures; faster-whisper (open-source Whisper small/base on CPU) as the offline fallback</w:t>
             </w:r>
           </w:p>
         </w:tc>
@@ -5636,7 +5636,7 @@
                 <w:sz w:val="21"/>
                 <w:szCs w:val="21"/>
               </w:rPr>
-              <w:t xml:space="preserve">Small open-source LLM (e.g. Llama 3.2 3B or Qwen2.5 3B) served on Hugging Face Spaces or locally through Ollama; Groq free tier for faster responses</w:t>
+              <w:t xml:space="preserve">Groq free tier (Llama) for live answers; small open-source LLM (Llama 3.2 3B or Qwen2.5 3B) through Ollama as the documented offline fallback; pgvector for retrieval</w:t>
             </w:r>
           </w:p>
         </w:tc>
@@ -5695,7 +5695,7 @@
                 <w:sz w:val="21"/>
                 <w:szCs w:val="21"/>
               </w:rPr>
-              <w:t xml:space="preserve">Supabase free tier (PostgreSQL with pgvector), Upstash free tier (Redis)</w:t>
+              <w:t xml:space="preserve">Supabase free tier (PostgreSQL with pgvector); SQLite for local development</w:t>
             </w:r>
           </w:p>
         </w:tc>
@@ -5813,7 +5813,7 @@
                 <w:sz w:val="21"/>
                 <w:szCs w:val="21"/>
               </w:rPr>
-              <w:t xml:space="preserve">Hugging Face Spaces (free CPU, Docker) for the FastAPI backend and AI services; Supabase and Upstash hold all data because free Spaces storage is not permanent</w:t>
+              <w:t xml:space="preserve">Oracle Cloud Always Free virtual machine (Arm, 4 cores, 24 GB RAM) running the FastAPI backend and AI services in Docker; Azure for Students credit from the GitHub Student Developer Pack as the fallback; Supabase holds persistent data</w:t>
             </w:r>
           </w:p>
         </w:tc>
@@ -6068,6 +6068,15 @@
           <w:szCs w:val="20"/>
         </w:rPr>
         <w:t xml:space="preserve">Table 4: Software tools and technologies (zero-cost stack)</w:t>
+      </w:r>
+    </w:p>
+    <w:p>
+      <w:pPr>
+        <w:spacing w:after="120" w:line="264"/>
+        <w:jc w:val="both"/>
+      </w:pPr>
+      <w:r>
+        <w:t xml:space="preserve">The free-tier limits that matter are known in advance. LiveKit Cloud allows 5,000 participant-minutes a month, which one fifty-student lecture would largely consume, so load tests run against the self-hosted LiveKit server on the VM and the Cloud plan is kept for live demonstrations. Supabase pauses an idle free project after a week, so a scheduled health check keeps it awake during the semester.</w:t>
       </w:r>
     </w:p>
     <w:p>
@@ -6135,7 +6144,7 @@
         <w:jc w:val="both"/>
       </w:pPr>
       <w:r>
-        <w:t xml:space="preserve">Free infrastructure for deployment: Vercel (frontend), Hugging Face Spaces (backend and AI services), LiveKit Cloud (audio/video) and Supabase/Upstash (data), so hosting costs nothing.</w:t>
+        <w:t xml:space="preserve">Free infrastructure for deployment: Vercel (frontend), an Oracle Cloud Always Free VM (backend, AI services and the self-hosted LiveKit server for load tests), LiveKit Cloud (audio/video for demos) and Supabase (data), so hosting costs nothing.</w:t>
       </w:r>
     </w:p>
     <w:p>
@@ -7286,7 +7295,7 @@
                 <w:sz w:val="21"/>
                 <w:szCs w:val="21"/>
               </w:rPr>
-              <w:t xml:space="preserve">Service integration, deployment on Vercel and Hugging Face Spaces</w:t>
+              <w:t xml:space="preserve">Service integration, deployment on Vercel and the project VM</w:t>
             </w:r>
           </w:p>
         </w:tc>

</xml_diff>